<commit_message>
docs: replace screenshots in docs/screenshots and update final report docx/pdf with all 5 new figures
</commit_message>
<xml_diff>
--- a/docs/RecursosVE_EntregaFinalCurso.docx
+++ b/docs/RecursosVE_EntregaFinalCurso.docx
@@ -2506,14 +2506,13 @@
     </w:p>
     <w:p>
       <w:pPr>
-        <w:spacing w:before="120" w:after="20"/>
         <w:jc w:val="center"/>
       </w:pPr>
       <w:r>
         <w:drawing>
           <wp:inline xmlns:a="http://schemas.openxmlformats.org/drawingml/2006/main" xmlns:pic="http://schemas.openxmlformats.org/drawingml/2006/picture">
-            <wp:extent cx="4754880" cy="4754880"/>
-            <wp:docPr id="3" name="Picture 3"/>
+            <wp:extent cx="5486400" cy="4514984"/>
+            <wp:docPr id="8" name="Picture 8"/>
             <wp:cNvGraphicFramePr>
               <a:graphicFrameLocks noChangeAspect="1"/>
             </wp:cNvGraphicFramePr>
@@ -2521,7 +2520,7 @@
               <a:graphicData uri="http://schemas.openxmlformats.org/drawingml/2006/picture">
                 <pic:pic>
                   <pic:nvPicPr>
-                    <pic:cNvPr id="0" name="recursosve_wireframes.png"/>
+                    <pic:cNvPr id="0" name="image.png"/>
                     <pic:cNvPicPr/>
                   </pic:nvPicPr>
                   <pic:blipFill>
@@ -2533,7 +2532,7 @@
                   <pic:spPr>
                     <a:xfrm>
                       <a:off x="0" y="0"/>
-                      <a:ext cx="4754880" cy="4754880"/>
+                      <a:ext cx="5486400" cy="4514984"/>
                     </a:xfrm>
                     <a:prstGeom prst="rect"/>
                   </pic:spPr>
@@ -2542,6 +2541,222 @@
             </a:graphic>
           </wp:inline>
         </w:drawing>
+      </w:r>
+    </w:p>
+    <w:p>
+      <w:pPr>
+        <w:jc w:val="center"/>
+      </w:pPr>
+      <w:r>
+        <w:rPr>
+          <w:i/>
+          <w:sz w:val="20"/>
+        </w:rPr>
+        <w:t xml:space="preserve">Figura 3. Dashboard Principal del Centro de Mando Logístico con Mapa Real Leaflet y Zonas de Impacto</w:t>
+      </w:r>
+    </w:p>
+    <w:p>
+      <w:pPr>
+        <w:jc w:val="center"/>
+      </w:pPr>
+      <w:r>
+        <w:drawing>
+          <wp:inline xmlns:a="http://schemas.openxmlformats.org/drawingml/2006/main" xmlns:pic="http://schemas.openxmlformats.org/drawingml/2006/picture">
+            <wp:extent cx="5486400" cy="4315755"/>
+            <wp:docPr id="9" name="Picture 9"/>
+            <wp:cNvGraphicFramePr>
+              <a:graphicFrameLocks noChangeAspect="1"/>
+            </wp:cNvGraphicFramePr>
+            <a:graphic>
+              <a:graphicData uri="http://schemas.openxmlformats.org/drawingml/2006/picture">
+                <pic:pic>
+                  <pic:nvPicPr>
+                    <pic:cNvPr id="0" name="2.png"/>
+                    <pic:cNvPicPr/>
+                  </pic:nvPicPr>
+                  <pic:blipFill>
+                    <a:blip r:embed="rId16"/>
+                    <a:stretch>
+                      <a:fillRect/>
+                    </a:stretch>
+                  </pic:blipFill>
+                  <pic:spPr>
+                    <a:xfrm>
+                      <a:off x="0" y="0"/>
+                      <a:ext cx="5486400" cy="4315755"/>
+                    </a:xfrm>
+                    <a:prstGeom prst="rect"/>
+                  </pic:spPr>
+                </pic:pic>
+              </a:graphicData>
+            </a:graphic>
+          </wp:inline>
+        </w:drawing>
+      </w:r>
+    </w:p>
+    <w:p>
+      <w:pPr>
+        <w:jc w:val="center"/>
+      </w:pPr>
+      <w:r>
+        <w:rPr>
+          <w:i/>
+          <w:sz w:val="20"/>
+        </w:rPr>
+        <w:t xml:space="preserve">Figura 4. Pantalla de Autenticación y Selección de Rol con RBAC Estricto</w:t>
+      </w:r>
+    </w:p>
+    <w:p>
+      <w:pPr>
+        <w:jc w:val="center"/>
+      </w:pPr>
+      <w:r>
+        <w:drawing>
+          <wp:inline xmlns:a="http://schemas.openxmlformats.org/drawingml/2006/main" xmlns:pic="http://schemas.openxmlformats.org/drawingml/2006/picture">
+            <wp:extent cx="5486400" cy="4315755"/>
+            <wp:docPr id="10" name="Picture 10"/>
+            <wp:cNvGraphicFramePr>
+              <a:graphicFrameLocks noChangeAspect="1"/>
+            </wp:cNvGraphicFramePr>
+            <a:graphic>
+              <a:graphicData uri="http://schemas.openxmlformats.org/drawingml/2006/picture">
+                <pic:pic>
+                  <pic:nvPicPr>
+                    <pic:cNvPr id="0" name="image.png"/>
+                    <pic:cNvPicPr/>
+                  </pic:nvPicPr>
+                  <pic:blipFill>
+                    <a:blip r:embed="rId13"/>
+                    <a:stretch>
+                      <a:fillRect/>
+                    </a:stretch>
+                  </pic:blipFill>
+                  <pic:spPr>
+                    <a:xfrm>
+                      <a:off x="0" y="0"/>
+                      <a:ext cx="5486400" cy="4315755"/>
+                    </a:xfrm>
+                    <a:prstGeom prst="rect"/>
+                  </pic:spPr>
+                </pic:pic>
+              </a:graphicData>
+            </a:graphic>
+          </wp:inline>
+        </w:drawing>
+      </w:r>
+    </w:p>
+    <w:p>
+      <w:pPr>
+        <w:jc w:val="center"/>
+      </w:pPr>
+      <w:r>
+        <w:rPr>
+          <w:i/>
+          <w:sz w:val="20"/>
+        </w:rPr>
+        <w:t xml:space="preserve">Figura 5. Portal del Donante, Catálogo de Insumos y Módulo de Emparejamiento Directo</w:t>
+      </w:r>
+    </w:p>
+    <w:p>
+      <w:pPr>
+        <w:jc w:val="center"/>
+      </w:pPr>
+      <w:r>
+        <w:drawing>
+          <wp:inline xmlns:a="http://schemas.openxmlformats.org/drawingml/2006/main" xmlns:pic="http://schemas.openxmlformats.org/drawingml/2006/picture">
+            <wp:extent cx="5486400" cy="6156251"/>
+            <wp:docPr id="11" name="Picture 11"/>
+            <wp:cNvGraphicFramePr>
+              <a:graphicFrameLocks noChangeAspect="1"/>
+            </wp:cNvGraphicFramePr>
+            <a:graphic>
+              <a:graphicData uri="http://schemas.openxmlformats.org/drawingml/2006/picture">
+                <pic:pic>
+                  <pic:nvPicPr>
+                    <pic:cNvPr id="0" name="image.png"/>
+                    <pic:cNvPicPr/>
+                  </pic:nvPicPr>
+                  <pic:blipFill>
+                    <a:blip r:embed="rId12"/>
+                    <a:stretch>
+                      <a:fillRect/>
+                    </a:stretch>
+                  </pic:blipFill>
+                  <pic:spPr>
+                    <a:xfrm>
+                      <a:off x="0" y="0"/>
+                      <a:ext cx="5486400" cy="6156251"/>
+                    </a:xfrm>
+                    <a:prstGeom prst="rect"/>
+                  </pic:spPr>
+                </pic:pic>
+              </a:graphicData>
+            </a:graphic>
+          </wp:inline>
+        </w:drawing>
+      </w:r>
+    </w:p>
+    <w:p>
+      <w:pPr>
+        <w:jc w:val="center"/>
+      </w:pPr>
+      <w:r>
+        <w:rPr>
+          <w:i/>
+          <w:sz w:val="20"/>
+        </w:rPr>
+        <w:t xml:space="preserve">Figura 6. Formulario Único de Captura de Necesidades con Agente 1 (NLP Qwen2.5 / Checkbox Manual)</w:t>
+      </w:r>
+    </w:p>
+    <w:p>
+      <w:pPr>
+        <w:jc w:val="center"/>
+      </w:pPr>
+      <w:r>
+        <w:drawing>
+          <wp:inline xmlns:a="http://schemas.openxmlformats.org/drawingml/2006/main" xmlns:pic="http://schemas.openxmlformats.org/drawingml/2006/picture">
+            <wp:extent cx="5486400" cy="4283724"/>
+            <wp:docPr id="12" name="Picture 12"/>
+            <wp:cNvGraphicFramePr>
+              <a:graphicFrameLocks noChangeAspect="1"/>
+            </wp:cNvGraphicFramePr>
+            <a:graphic>
+              <a:graphicData uri="http://schemas.openxmlformats.org/drawingml/2006/picture">
+                <pic:pic>
+                  <pic:nvPicPr>
+                    <pic:cNvPr id="0" name="5.png"/>
+                    <pic:cNvPicPr/>
+                  </pic:nvPicPr>
+                  <pic:blipFill>
+                    <a:blip r:embed="rId17"/>
+                    <a:stretch>
+                      <a:fillRect/>
+                    </a:stretch>
+                  </pic:blipFill>
+                  <pic:spPr>
+                    <a:xfrm>
+                      <a:off x="0" y="0"/>
+                      <a:ext cx="5486400" cy="4283724"/>
+                    </a:xfrm>
+                    <a:prstGeom prst="rect"/>
+                  </pic:spPr>
+                </pic:pic>
+              </a:graphicData>
+            </a:graphic>
+          </wp:inline>
+        </w:drawing>
+      </w:r>
+    </w:p>
+    <w:p>
+      <w:pPr>
+        <w:jc w:val="center"/>
+      </w:pPr>
+      <w:r>
+        <w:rPr>
+          <w:i/>
+          <w:sz w:val="20"/>
+        </w:rPr>
+        <w:t xml:space="preserve">Figura 7. Módulo de Registro y Gestión de Infraestructuras (Refugios, Acopios y Zonas de Desastre)</w:t>
       </w:r>
     </w:p>
     <w:p>
@@ -2562,46 +2777,6 @@
     </w:p>
     <w:p>
       <w:pPr>
-        <w:spacing w:before="120" w:after="20"/>
-        <w:jc w:val="center"/>
-      </w:pPr>
-      <w:r>
-        <w:drawing>
-          <wp:inline xmlns:a="http://schemas.openxmlformats.org/drawingml/2006/main" xmlns:pic="http://schemas.openxmlformats.org/drawingml/2006/picture">
-            <wp:extent cx="4754880" cy="4754880"/>
-            <wp:docPr id="4" name="Picture 4"/>
-            <wp:cNvGraphicFramePr>
-              <a:graphicFrameLocks noChangeAspect="1"/>
-            </wp:cNvGraphicFramePr>
-            <a:graphic>
-              <a:graphicData uri="http://schemas.openxmlformats.org/drawingml/2006/picture">
-                <pic:pic>
-                  <pic:nvPicPr>
-                    <pic:cNvPr id="0" name="recursosve_wireframe_flow1.png"/>
-                    <pic:cNvPicPr/>
-                  </pic:nvPicPr>
-                  <pic:blipFill>
-                    <a:blip r:embed="rId12"/>
-                    <a:stretch>
-                      <a:fillRect/>
-                    </a:stretch>
-                  </pic:blipFill>
-                  <pic:spPr>
-                    <a:xfrm>
-                      <a:off x="0" y="0"/>
-                      <a:ext cx="4754880" cy="4754880"/>
-                    </a:xfrm>
-                    <a:prstGeom prst="rect"/>
-                  </pic:spPr>
-                </pic:pic>
-              </a:graphicData>
-            </a:graphic>
-          </wp:inline>
-        </w:drawing>
-      </w:r>
-    </w:p>
-    <w:p>
-      <w:pPr>
         <w:spacing w:before="0" w:after="120"/>
         <w:jc w:val="center"/>
       </w:pPr>
@@ -2614,46 +2789,6 @@
           <w:sz w:val="18"/>
         </w:rPr>
         <w:t>Figura 4. Portal del Donante y Módulo de Emparejamiento Directo</w:t>
-      </w:r>
-    </w:p>
-    <w:p>
-      <w:pPr>
-        <w:spacing w:before="120" w:after="20"/>
-        <w:jc w:val="center"/>
-      </w:pPr>
-      <w:r>
-        <w:drawing>
-          <wp:inline xmlns:a="http://schemas.openxmlformats.org/drawingml/2006/main" xmlns:pic="http://schemas.openxmlformats.org/drawingml/2006/picture">
-            <wp:extent cx="4754880" cy="4754880"/>
-            <wp:docPr id="5" name="Picture 5"/>
-            <wp:cNvGraphicFramePr>
-              <a:graphicFrameLocks noChangeAspect="1"/>
-            </wp:cNvGraphicFramePr>
-            <a:graphic>
-              <a:graphicData uri="http://schemas.openxmlformats.org/drawingml/2006/picture">
-                <pic:pic>
-                  <pic:nvPicPr>
-                    <pic:cNvPr id="0" name="recursosve_wireframe_flow2.png"/>
-                    <pic:cNvPicPr/>
-                  </pic:nvPicPr>
-                  <pic:blipFill>
-                    <a:blip r:embed="rId13"/>
-                    <a:stretch>
-                      <a:fillRect/>
-                    </a:stretch>
-                  </pic:blipFill>
-                  <pic:spPr>
-                    <a:xfrm>
-                      <a:off x="0" y="0"/>
-                      <a:ext cx="4754880" cy="4754880"/>
-                    </a:xfrm>
-                    <a:prstGeom prst="rect"/>
-                  </pic:spPr>
-                </pic:pic>
-              </a:graphicData>
-            </a:graphic>
-          </wp:inline>
-        </w:drawing>
       </w:r>
     </w:p>
     <w:p>
@@ -2674,75 +2809,10 @@
     </w:p>
     <w:p>
       <w:pPr>
-        <w:spacing w:before="0" w:after="60"/>
-        <w:jc w:val="both"/>
-      </w:pPr>
-      <w:r>
-        <w:rPr>
-          <w:rFonts w:ascii="Calibri" w:hAnsi="Calibri"/>
-          <w:b/>
-          <w:i w:val="0"/>
-          <w:sz w:val="22"/>
-        </w:rPr>
-        <w:t>Log / Registro de Ejecución de una Sesión Real (Simulación Validada):</w:t>
-      </w:r>
-    </w:p>
-    <w:p>
-      <w:pPr>
         <w:pStyle w:val="Heading2"/>
       </w:pPr>
       <w:r>
         <w:t>5.1 Resumen de Últimas Funcionalidades y Mejoras de Arquitectura Incorporadas</w:t>
-      </w:r>
-    </w:p>
-    <w:p>
-      <w:r>
-        <w:t>Durante la fase final de consolidación del sistema RecursosVE, se incorporaron las siguientes mejoras clave de arquitectura, modelo de dominio y diseño UX/UI:</w:t>
-        <w:br/>
-        <w:br/>
-        <w:t>1. Control de Acceso Manual (RBAC Estricto):</w:t>
-        <w:br/>
-        <w:t>Se eliminó el autocompletado automático de credenciales en los botones de roles de la pantalla de Login (/login). Las credenciales oficiales de prueba de cada rol (Coordinador: coordinador@recursosve.org / coord123, Brigadista: brigadista@recursosve.org / briga123, Donante: donante@recursosve.org / donant123, Transportista: transportista4@recursosve.org / driver123) se documentan explícitamente en este informe y requieren ingreso manual para validar el flujo real de autenticación.</w:t>
-        <w:br/>
-        <w:br/>
-        <w:t>2. Persistencia End-to-End de Donaciones en Base de Datos:</w:t>
-        <w:br/>
-        <w:t>Se implementó la persistencia completa del ciclo de vida de la entidad DonationOffer. Las ofertas enviadas por los donantes se registran a través del servicio OfferDonationService y el repositorio DonationRepository de NestJS, garantizando la trazabilidad histórica de los insumos ofertados.</w:t>
-        <w:br/>
-        <w:br/>
-        <w:t>3. Tabla y Catálogo de Donaciones en Tiempo Real:</w:t>
-        <w:br/>
-        <w:t>Se incorporó en el Portal del Donante (/donar) la Tabla de Donaciones Registradas en el Sistema, la cual sincroniza directamente vía GET /api/donations los datos persistidos en el backend, mostrando el ID de transacción, el donante, insumo, cantidad, ubicación de origen y el estado del despacho (OFERTADA, ASIGNADA, EN_TRANSITO, ENTREGADA).</w:t>
-        <w:br/>
-        <w:br/>
-        <w:t>4. Información Táctica de Despacho e Instrucciones de Entrega:</w:t>
-        <w:br/>
-        <w:t>Al ser emparejada una donación mediante el algoritmo del Agente Coordinador, el resultado proporciona al donante el contacto telefónico directo del coordinador de campamento receptor y el punto exacto de entrega, asegurando transparencia logística total.</w:t>
-        <w:br/>
-        <w:br/>
-        <w:t>5. Desacoplamiento y Persistencia de Atributos de Vehículos en PostgreSQL:</w:t>
-        <w:br/>
-        <w:t>Se migró la especificación de unidades de transporte (vehiculoTipo y vehiculoCapacidad) desde cadenas concatenadas en el nombre hacia columnas independientes y relacionales dentro de la tabla users en PostgreSQL. Se actualizaron las entidades User (Dominio) y UserOrmEntity (NestJS/TypeORM), permitiendo al algoritmo de ruteo del Agente 3 (Match Engine) evaluar la idoneidad y volumen del vehículo (ej. Furgón Médico Refrigerado de 2.0T con cadena de frío vs. Pick-Up 4x4 o Chuto 10T).</w:t>
-        <w:br/>
-        <w:br/>
-        <w:t>6. Automatización del Ciclo de Vida del Transportista y FSM de Despachos:</w:t>
-        <w:br/>
-        <w:t>Se implementó la transición automática e inmediata del estado del transportista a DISPONIBLE al marcar un despacho como ENTREGADO. El backend (ManageShipmentService) actualiza la fecha de entrega y remueve el despacho entregado de la consulta de misiones activas (getAssignedShipment). La vista driver-dashboard.view.tsx resetea la sesión del despacho entregado a null, forzando la liberación inmediata del transportista para recibir nuevas asignaciones. En el mapa interactivo (Leaflet OSM), los transportistas en estado DISPONIBLE ocultan rutas o misiones finalizadas.</w:t>
-        <w:br/>
-        <w:br/>
-        <w:t>7. Integración y Garantía de Sincronización de Roles (RBAC Sync):</w:t>
-        <w:br/>
-        <w:t>Se reforzó el bucle de sincronización en la inicialización del backend (UserPostgresRepository.onModuleInit()). Durante la siembra inicial, el sistema verifica y actualiza forzosamente el campo role (rol_id = 1 para Coordinador, rol_id = 2 para Brigadista, etc.) en los usuarios preexistentes de PostgreSQL, previniendo derivaciones incorrectas de rol en autenticación.</w:t>
-        <w:br/>
-        <w:br/>
-        <w:t>8. Rediseño UX/UI del Formulario de Captura de Necesidades (Vista Única con Checkbox Táctico):</w:t>
-        <w:br/>
-        <w:t>Se refactorizó el formulario de creación de reportes (create-report-form.view.tsx), reemplazando el selector por pestañas (Agente 1 NLP vs Formulario Estructurado) por una vista única e integrada. Se incorporó la casilla [ ] Ingresar datos manualmente: desmarcada, despliega el asistente del Agente 1 (NLP Qwen2.5 local vía Ollama) para procesamiento inteligente de texto informal; marcada, colapsa el bloque de IA para permitir el llenado directo y rápido sin asistencia.</w:t>
-        <w:br/>
-        <w:br/>
-        <w:t>9. Maquetación 2x2 y Jerarquía en el Centro de Mando del Coordinador:</w:t>
-        <w:br/>
-        <w:t>Se reorganizó la botonera del panel de control del coordinador (coordinator-dashboard.view.tsx) en una grilla compacta de 2x2 alineada a la derecha (ml-auto) con los accesos rápidos (Usuarios DB, Agente 3: Ruteo, Gestionar Registrados, + Registrar Infraestructura), optimizando la jerarquía visual y la ergonomía sin obstruir la visualización del mapa de desastres Leaflet.</w:t>
       </w:r>
     </w:p>
     <w:p>
@@ -2770,23 +2840,6 @@
         <w:t>[AGENTE_EVALUADOR] Confirmación de Recepción por Coordinador (Cap. Rivas): FSM Status -&gt; CUBIERTA (resolvedAt: 2026-08-19T15:12:00Z)</w:t>
         <w:br/>
         <w:t>[AGENTE_APRENDIZAJE] Métrica registrada: Tiempo de cobertura = 42 min | Tasa de resolución local incrementada a 42.5%</w:t>
-      </w:r>
-    </w:p>
-    <w:p>
-      <w:pPr>
-        <w:pStyle w:val="Heading2"/>
-        <w:pageBreakBefore w:val="0"/>
-        <w:spacing w:before="100" w:after="60"/>
-        <w:jc w:val="left"/>
-      </w:pPr>
-      <w:r>
-        <w:rPr>
-          <w:rFonts w:ascii="Calibri" w:hAnsi="Calibri"/>
-          <w:b/>
-          <w:color w:val="1F4E79"/>
-          <w:sz w:val="24"/>
-        </w:rPr>
-        <w:t>6. Evaluación UX/UI y Heurísticas de Nielsen</w:t>
       </w:r>
     </w:p>
     <w:p>

</xml_diff>